<commit_message>
Release v0.4.0 with revised S-AA workflows and supplementary analyses
</commit_message>
<xml_diff>
--- a/Supplementary_S1_Workflow_Description.docx
+++ b/Supplementary_S1_Workflow_Description.docx
@@ -5,88 +5,209 @@
     <w:p>
       <w:pPr>
         <w:pStyle w:val="Title"/>
+        <w:rPr>
+          <w:sz w:val="28"/>
+          <w:szCs w:val="28"/>
+        </w:rPr>
       </w:pPr>
       <w:r>
-        <w:t>Supplementary</w:t>
-      </w:r>
-      <w:r>
-        <w:t xml:space="preserve"> Material S1</w:t>
+        <w:rPr>
+          <w:sz w:val="28"/>
+          <w:szCs w:val="28"/>
+        </w:rPr>
+        <w:t>Supplementary Material S1</w:t>
       </w:r>
     </w:p>
     <w:p>
       <w:pPr>
         <w:pStyle w:val="Title"/>
         <w:rPr>
-          <w:sz w:val="28"/>
-          <w:szCs w:val="28"/>
+          <w:sz w:val="24"/>
+          <w:szCs w:val="24"/>
         </w:rPr>
       </w:pPr>
       <w:r>
         <w:rPr>
-          <w:sz w:val="28"/>
-          <w:szCs w:val="28"/>
+          <w:sz w:val="24"/>
+          <w:szCs w:val="24"/>
         </w:rPr>
         <w:t>A Computational Workflow for Proteome-Wide Analysis of Sulfur-Containing Amino Acid Distribution in Crop Proteomes</w:t>
       </w:r>
     </w:p>
     <w:p>
-      <w:r>
-        <w:t>This document describes the computational workflow used in this study. Jupyter Notebooks (Supplementary Materials S2–S5) were developed to document and reproduce all computational analyses for each species</w:t>
-      </w:r>
-      <w:r>
-        <w:t>. The notebook implements a custom Python library designed for proteome-wide amino acid composition analysis, with particular emphasis on sulfur-containing amino acids (methionine and cysteine).</w:t>
+      <w:pPr>
+        <w:spacing w:line="276" w:lineRule="auto"/>
+        <w:rPr>
+          <w:sz w:val="22"/>
+          <w:szCs w:val="22"/>
+        </w:rPr>
+      </w:pPr>
+      <w:r>
+        <w:rPr>
+          <w:sz w:val="22"/>
+          <w:szCs w:val="22"/>
+        </w:rPr>
+        <w:t>This document describes the computational workflow used in this study. Species-specific Jupyter Notebooks (Supplementary Materials S2a to S5b) document and reproduce the analyses performed for each crop proteome, while the comparative notebook provides the proteome-level descriptive comparison. The notebooks use the custom Python library saa_proteome, developed for proteome-wide amino-acid composition analysis with particular emphasis on methionine and cysteine.</w:t>
       </w:r>
     </w:p>
     <w:p>
-      <w:r>
-        <w:t xml:space="preserve">The workflow begins with validation and parsing of proteome FASTA files obtained from UniProt reference proteomes. </w:t>
-      </w:r>
-      <w:r>
-        <w:t>Protein sequences are processed using a standardized cleaning procedure that retains only the 20 canonical amino acids and removes stop-codon symbols ("*"). Optionally, the N-terminal methionine residue can be removed (</w:t>
+      <w:pPr>
+        <w:spacing w:line="276" w:lineRule="auto"/>
+        <w:rPr>
+          <w:sz w:val="22"/>
+          <w:szCs w:val="22"/>
+        </w:rPr>
+      </w:pPr>
+      <w:r>
+        <w:rPr>
+          <w:sz w:val="22"/>
+          <w:szCs w:val="22"/>
+        </w:rPr>
+        <w:t xml:space="preserve">The workflow begins with validation and parsing of FASTA files obtained from UniProt reference proteomes. Protein sequences are normalized before analysis. When </w:t>
       </w:r>
       <w:proofErr w:type="spellStart"/>
       <w:r>
+        <w:rPr>
+          <w:sz w:val="22"/>
+          <w:szCs w:val="22"/>
+        </w:rPr>
         <w:t>remove_start_m</w:t>
       </w:r>
       <w:proofErr w:type="spellEnd"/>
       <w:r>
-        <w:t>) to account for common post-translational methionine excision in eukaryotic proteins.</w:t>
-      </w:r>
-      <w:r>
-        <w:t xml:space="preserve"> </w:t>
-      </w:r>
-      <w:r>
-        <w:t>All sequence processing steps are explicitly parameterized and fully reproducible.</w:t>
+        <w:rPr>
+          <w:sz w:val="22"/>
+          <w:szCs w:val="22"/>
+        </w:rPr>
+        <w:t>=True, an N-terminal methionine is removed only when it occurs as the first residue of the normalized original sequence; optional canonical-residue filtering is then applied to retain the 20 standard amino acids and exclude noncanonical symbols. The initial-methionine-removed condition was evaluated as a sensitivity analysis because actual N-terminal methionine excision depends on biological and sequence context and cannot be inferred from reference-proteome sequences alone. All preprocessing steps are explicitly parameterized and reproducible.</w:t>
       </w:r>
     </w:p>
     <w:p>
-      <w:r>
-        <w:t>Protein-level metrics, including sequence length, methionine percentage, cysteine percentage, and combined sulfur-amino-acid content, are computed and stored in structured pandas DataFrames. Proteins are subsequently ranked according to sulfur-containing amino acid abundance, and user-defined subsets (e.g., top 10 sulfur-rich proteins) are selected for downstream analysis.</w:t>
+      <w:pPr>
+        <w:spacing w:line="276" w:lineRule="auto"/>
+        <w:rPr>
+          <w:sz w:val="22"/>
+          <w:szCs w:val="22"/>
+        </w:rPr>
+      </w:pPr>
+      <w:r>
+        <w:rPr>
+          <w:sz w:val="22"/>
+          <w:szCs w:val="22"/>
+        </w:rPr>
+        <w:t>Protein-level outputs include raw, cleaned, and adjusted sequence lengths; preprocessing flags; methionine, cysteine, and combined sulfur-containing amino-acid (S-AA) percentages; and related composition descriptors. Proteins can be ranked by any numerical metric, and defined subsets, including the proteins with the highest total S-AA percentages, can be selected for downstream analysis.</w:t>
       </w:r>
     </w:p>
     <w:p>
-      <w:r>
-        <w:t>These matrices quantify the relative frequency (0–1) of each canonical amino acid per protein. Alternative value scales (counts or percentages) are supported by the computational functions, although frequency values were used for visualization in this study.</w:t>
+      <w:pPr>
+        <w:spacing w:line="276" w:lineRule="auto"/>
+        <w:rPr>
+          <w:sz w:val="22"/>
+          <w:szCs w:val="22"/>
+        </w:rPr>
+      </w:pPr>
+      <w:r>
+        <w:rPr>
+          <w:sz w:val="22"/>
+          <w:szCs w:val="22"/>
+        </w:rPr>
+        <w:t xml:space="preserve">Localized enrichment is quantified using overlapping sliding windows. For each protein, the workflow calculates the maximum methionine, cysteine, and combined S-AA percentages observed within windows defined by the selected </w:t>
+      </w:r>
+      <w:proofErr w:type="spellStart"/>
+      <w:r>
+        <w:rPr>
+          <w:sz w:val="22"/>
+          <w:szCs w:val="22"/>
+        </w:rPr>
+        <w:t>window_size</w:t>
+      </w:r>
+      <w:proofErr w:type="spellEnd"/>
+      <w:r>
+        <w:rPr>
+          <w:sz w:val="22"/>
+          <w:szCs w:val="22"/>
+        </w:rPr>
+        <w:t xml:space="preserve"> and </w:t>
+      </w:r>
+      <w:proofErr w:type="spellStart"/>
+      <w:r>
+        <w:rPr>
+          <w:sz w:val="22"/>
+          <w:szCs w:val="22"/>
+        </w:rPr>
+        <w:t>window_step</w:t>
+      </w:r>
+      <w:proofErr w:type="spellEnd"/>
+      <w:r>
+        <w:rPr>
+          <w:sz w:val="22"/>
+          <w:szCs w:val="22"/>
+        </w:rPr>
+        <w:t xml:space="preserve"> parameters. In this study, 100-amino-acid windows with a one-residue step were used for the localized-enrichment analysis.</w:t>
       </w:r>
     </w:p>
     <w:p>
-      <w:r>
-        <w:t>The computational functions return numerical matrices only, while graphical representation is performed at the notebook level using standard visualization libraries, allowing flexible adjustment of color scales, resolution, and figure layout for publication.</w:t>
+      <w:pPr>
+        <w:spacing w:line="276" w:lineRule="auto"/>
+        <w:rPr>
+          <w:sz w:val="22"/>
+          <w:szCs w:val="22"/>
+        </w:rPr>
+      </w:pPr>
+      <w:r>
+        <w:rPr>
+          <w:sz w:val="22"/>
+          <w:szCs w:val="22"/>
+        </w:rPr>
+        <w:t xml:space="preserve">Amino-acid composition matrices quantify the relative frequency, from 0 to 1, of each canonical amino acid within each selected protein. Counts and percentages are also supported. The analytical functions return structured numerical outputs, including pandas </w:t>
+      </w:r>
+      <w:proofErr w:type="spellStart"/>
+      <w:r>
+        <w:rPr>
+          <w:sz w:val="22"/>
+          <w:szCs w:val="22"/>
+        </w:rPr>
+        <w:t>DataFrames</w:t>
+      </w:r>
+      <w:proofErr w:type="spellEnd"/>
+      <w:r>
+        <w:rPr>
+          <w:sz w:val="22"/>
+          <w:szCs w:val="22"/>
+        </w:rPr>
+        <w:t>, summary statistics, ranking tables, and visualization-ready matrices. Graphical representation is performed at the notebook level using standard visualization libraries, allowing adjustment of color scales, resolution, and figure layout.</w:t>
       </w:r>
     </w:p>
     <w:p>
-      <w:r>
-        <w:t xml:space="preserve">All intermediate and final outputs are stored as DataFrames (df) to facilitate inspection, reuse, and export as supplementary tables. </w:t>
-      </w:r>
-      <w:r>
-        <w:t xml:space="preserve">The notebook therefore provides a transparent and reproducible record of the full analytical pipeline, from raw proteome sequences to ranked sulfur-amino-acid profiles and associated visual summaries. All analyses were conducted using the custom Python library </w:t>
-      </w:r>
-      <w:r>
-        <w:lastRenderedPageBreak/>
-        <w:t xml:space="preserve">saa_proteome </w:t>
-      </w:r>
-      <w:r>
-        <w:t>together with the accompanying Jupyter Notebooks provided as Supplementary Materials S2–S5.</w:t>
+      <w:pPr>
+        <w:spacing w:line="276" w:lineRule="auto"/>
+        <w:rPr>
+          <w:sz w:val="22"/>
+          <w:szCs w:val="22"/>
+        </w:rPr>
+      </w:pPr>
+      <w:r>
+        <w:rPr>
+          <w:sz w:val="22"/>
+          <w:szCs w:val="22"/>
+        </w:rPr>
+        <w:t xml:space="preserve">Intermediate and final analytical tables are retained as pandas </w:t>
+      </w:r>
+      <w:proofErr w:type="spellStart"/>
+      <w:r>
+        <w:rPr>
+          <w:sz w:val="22"/>
+          <w:szCs w:val="22"/>
+        </w:rPr>
+        <w:t>DataFrames</w:t>
+      </w:r>
+      <w:proofErr w:type="spellEnd"/>
+      <w:r>
+        <w:rPr>
+          <w:sz w:val="22"/>
+          <w:szCs w:val="22"/>
+        </w:rPr>
+        <w:t xml:space="preserve"> to facilitate inspection, reuse, and export, while figures are generated and saved separately. Together, the saa_proteome library and the accompanying notebooks provide a transparent and reproducible record of the complete pipeline, from raw proteome sequences to proteome-level summaries, ranked S-AA-rich proteins, localized-enrichment profiles, and associated visual outputs.</w:t>
       </w:r>
     </w:p>
     <w:sectPr>

</xml_diff>

<commit_message>
Update supplementary workflow description
</commit_message>
<xml_diff>
--- a/Supplementary_S1_Workflow_Description.docx
+++ b/Supplementary_S1_Workflow_Description.docx
@@ -5,6 +5,7 @@
     <w:p>
       <w:pPr>
         <w:pStyle w:val="Title"/>
+        <w:spacing w:line="276" w:lineRule="auto"/>
         <w:rPr>
           <w:sz w:val="28"/>
           <w:szCs w:val="28"/>
@@ -21,6 +22,7 @@
     <w:p>
       <w:pPr>
         <w:pStyle w:val="Title"/>
+        <w:spacing w:line="276" w:lineRule="auto"/>
         <w:rPr>
           <w:sz w:val="24"/>
           <w:szCs w:val="24"/>
@@ -63,23 +65,42 @@
           <w:sz w:val="22"/>
           <w:szCs w:val="22"/>
         </w:rPr>
-        <w:t xml:space="preserve">The workflow begins with validation and parsing of FASTA files obtained from UniProt reference proteomes. Protein sequences are normalized before analysis. When </w:t>
+        <w:t>The workflow begins with validation and parsing of species-specific FASTA files obtained from the UniProt reference proteomes listed in Table S1.</w:t>
       </w:r>
-      <w:proofErr w:type="spellStart"/>
       <w:r>
         <w:rPr>
           <w:sz w:val="22"/>
           <w:szCs w:val="22"/>
         </w:rPr>
-        <w:t>remove_start_m</w:t>
+        <w:t xml:space="preserve"> </w:t>
       </w:r>
-      <w:proofErr w:type="spellEnd"/>
       <w:r>
         <w:rPr>
           <w:sz w:val="22"/>
           <w:szCs w:val="22"/>
         </w:rPr>
-        <w:t>=True, an N-terminal methionine is removed only when it occurs as the first residue of the normalized original sequence; optional canonical-residue filtering is then applied to retain the 20 standard amino acids and exclude noncanonical symbols. The initial-methionine-removed condition was evaluated as a sensitivity analysis because actual N-terminal methionine excision depends on biological and sequence context and cannot be inferred from reference-proteome sequences alone. All preprocessing steps are explicitly parameterized and reproducible.</w:t>
+        <w:t>Protein sequences are normalized before analysis.</w:t>
+      </w:r>
+      <w:r>
+        <w:rPr>
+          <w:sz w:val="22"/>
+          <w:szCs w:val="22"/>
+        </w:rPr>
+        <w:t xml:space="preserve"> </w:t>
+      </w:r>
+      <w:r>
+        <w:rPr>
+          <w:sz w:val="22"/>
+          <w:szCs w:val="22"/>
+        </w:rPr>
+        <w:t>When remove_start_m=True, an N-terminal methionine is removed only when it occurs as the first residue of the normalized original sequence; optional canonical-residue filtering is then applied</w:t>
+      </w:r>
+      <w:r>
+        <w:rPr>
+          <w:sz w:val="22"/>
+          <w:szCs w:val="22"/>
+        </w:rPr>
+        <w:t xml:space="preserve"> to retain the 20 standard amino acids and exclude noncanonical symbols. The initial-methionine-removed condition was evaluated as a sensitivity analysis because actual N-terminal methionine excision depends on biological and sequence context and cannot be inferred from reference-proteome sequences alone. All preprocessing steps are explicitly parameterized and reproducible.</w:t>
       </w:r>
     </w:p>
     <w:p>
@@ -111,39 +132,7 @@
           <w:sz w:val="22"/>
           <w:szCs w:val="22"/>
         </w:rPr>
-        <w:t xml:space="preserve">Localized enrichment is quantified using overlapping sliding windows. For each protein, the workflow calculates the maximum methionine, cysteine, and combined S-AA percentages observed within windows defined by the selected </w:t>
-      </w:r>
-      <w:proofErr w:type="spellStart"/>
-      <w:r>
-        <w:rPr>
-          <w:sz w:val="22"/>
-          <w:szCs w:val="22"/>
-        </w:rPr>
-        <w:t>window_size</w:t>
-      </w:r>
-      <w:proofErr w:type="spellEnd"/>
-      <w:r>
-        <w:rPr>
-          <w:sz w:val="22"/>
-          <w:szCs w:val="22"/>
-        </w:rPr>
-        <w:t xml:space="preserve"> and </w:t>
-      </w:r>
-      <w:proofErr w:type="spellStart"/>
-      <w:r>
-        <w:rPr>
-          <w:sz w:val="22"/>
-          <w:szCs w:val="22"/>
-        </w:rPr>
-        <w:t>window_step</w:t>
-      </w:r>
-      <w:proofErr w:type="spellEnd"/>
-      <w:r>
-        <w:rPr>
-          <w:sz w:val="22"/>
-          <w:szCs w:val="22"/>
-        </w:rPr>
-        <w:t xml:space="preserve"> parameters. In this study, 100-amino-acid windows with a one-residue step were used for the localized-enrichment analysis.</w:t>
+        <w:t>Localized enrichment is quantified using overlapping sliding windows. For each protein, the workflow calculates the maximum methionine, cysteine, and combined S-AA percentages observed within windows defined by the selected window_size and window_step parameters. In this study, 100-amino-acid windows with a one-residue step were used for the localized-enrichment analysis.</w:t>
       </w:r>
     </w:p>
     <w:p>
@@ -159,23 +148,7 @@
           <w:sz w:val="22"/>
           <w:szCs w:val="22"/>
         </w:rPr>
-        <w:t xml:space="preserve">Amino-acid composition matrices quantify the relative frequency, from 0 to 1, of each canonical amino acid within each selected protein. Counts and percentages are also supported. The analytical functions return structured numerical outputs, including pandas </w:t>
-      </w:r>
-      <w:proofErr w:type="spellStart"/>
-      <w:r>
-        <w:rPr>
-          <w:sz w:val="22"/>
-          <w:szCs w:val="22"/>
-        </w:rPr>
-        <w:t>DataFrames</w:t>
-      </w:r>
-      <w:proofErr w:type="spellEnd"/>
-      <w:r>
-        <w:rPr>
-          <w:sz w:val="22"/>
-          <w:szCs w:val="22"/>
-        </w:rPr>
-        <w:t>, summary statistics, ranking tables, and visualization-ready matrices. Graphical representation is performed at the notebook level using standard visualization libraries, allowing adjustment of color scales, resolution, and figure layout.</w:t>
+        <w:t>Amino-acid composition matrices quantify the relative frequency, from 0 to 1, of each canonical amino acid within each selected protein. Counts and percentages are also supported. The analytical functions return structured numerical outputs, including pandas DataFrames, summary statistics, ranking tables, and visualization-ready matrices. Graphical representation is performed at the notebook level using standard visualization libraries, allowing adjustment of color scales, resolution, and figure layout.</w:t>
       </w:r>
     </w:p>
     <w:p>
@@ -191,28 +164,591 @@
           <w:sz w:val="22"/>
           <w:szCs w:val="22"/>
         </w:rPr>
-        <w:t xml:space="preserve">Intermediate and final analytical tables are retained as pandas </w:t>
+        <w:t>Intermediate and final analytical tables are retained as pandas DataFrames to facilitate inspection, reuse, and export, while figures are generated and saved separately. Together, the saa_proteome library and the accompanying notebooks provide a transparent and reproducible record of the complete pipeline, from raw proteome sequences to proteome-level summaries, ranked S-AA-rich proteins, localized-enrichment profiles, and associated visual outputs.</w:t>
       </w:r>
-      <w:proofErr w:type="spellStart"/>
-      <w:r>
+    </w:p>
+    <w:p>
+      <w:pPr>
+        <w:spacing w:line="240" w:lineRule="auto"/>
         <w:rPr>
           <w:sz w:val="22"/>
           <w:szCs w:val="22"/>
         </w:rPr>
-        <w:t>DataFrames</w:t>
-      </w:r>
-      <w:proofErr w:type="spellEnd"/>
+      </w:pPr>
       <w:r>
         <w:rPr>
+          <w:b/>
+          <w:bCs/>
           <w:sz w:val="22"/>
           <w:szCs w:val="22"/>
         </w:rPr>
-        <w:t xml:space="preserve"> to facilitate inspection, reuse, and export, while figures are generated and saved separately. Together, the saa_proteome library and the accompanying notebooks provide a transparent and reproducible record of the complete pipeline, from raw proteome sequences to proteome-level summaries, ranked S-AA-rich proteins, localized-enrichment profiles, and associated visual outputs.</w:t>
+        <w:t>Table S1</w:t>
       </w:r>
+      <w:r>
+        <w:rPr>
+          <w:b/>
+          <w:bCs/>
+          <w:sz w:val="22"/>
+          <w:szCs w:val="22"/>
+        </w:rPr>
+        <w:t>.</w:t>
+      </w:r>
+      <w:r>
+        <w:rPr>
+          <w:sz w:val="22"/>
+          <w:szCs w:val="22"/>
+        </w:rPr>
+        <w:t xml:space="preserve"> UniProt reference proteomes and corresponding FASTA files used for the comparative analysis of sulfur-containing amino-acid distribution in four legume species.</w:t>
+      </w:r>
+    </w:p>
+    <w:tbl>
+      <w:tblPr>
+        <w:tblStyle w:val="TableGrid"/>
+        <w:tblW w:w="0" w:type="auto"/>
+        <w:tblInd w:w="108" w:type="dxa"/>
+        <w:tblLook w:val="04A0" w:firstRow="1" w:lastRow="0" w:firstColumn="1" w:lastColumn="0" w:noHBand="0" w:noVBand="1"/>
+      </w:tblPr>
+      <w:tblGrid>
+        <w:gridCol w:w="1980"/>
+        <w:gridCol w:w="1721"/>
+        <w:gridCol w:w="1960"/>
+        <w:gridCol w:w="1809"/>
+        <w:gridCol w:w="2610"/>
+      </w:tblGrid>
+      <w:tr>
+        <w:tc>
+          <w:tcPr>
+            <w:tcW w:w="1980" w:type="dxa"/>
+            <w:vAlign w:val="center"/>
+          </w:tcPr>
+          <w:p>
+            <w:pPr>
+              <w:spacing w:line="276" w:lineRule="auto"/>
+              <w:jc w:val="left"/>
+            </w:pPr>
+            <w:r>
+              <w:rPr>
+                <w:b/>
+                <w:bCs/>
+                <w:sz w:val="22"/>
+                <w:szCs w:val="22"/>
+              </w:rPr>
+              <w:t>Species</w:t>
+            </w:r>
+          </w:p>
+        </w:tc>
+        <w:tc>
+          <w:tcPr>
+            <w:tcW w:w="1721" w:type="dxa"/>
+            <w:vAlign w:val="center"/>
+          </w:tcPr>
+          <w:p>
+            <w:pPr>
+              <w:spacing w:line="276" w:lineRule="auto"/>
+              <w:jc w:val="left"/>
+            </w:pPr>
+            <w:r>
+              <w:rPr>
+                <w:b/>
+                <w:bCs/>
+                <w:sz w:val="22"/>
+                <w:szCs w:val="22"/>
+              </w:rPr>
+              <w:t>Common name</w:t>
+            </w:r>
+          </w:p>
+        </w:tc>
+        <w:tc>
+          <w:tcPr>
+            <w:tcW w:w="1960" w:type="dxa"/>
+            <w:vAlign w:val="center"/>
+          </w:tcPr>
+          <w:p>
+            <w:pPr>
+              <w:spacing w:line="276" w:lineRule="auto"/>
+              <w:jc w:val="center"/>
+            </w:pPr>
+            <w:r>
+              <w:rPr>
+                <w:b/>
+                <w:bCs/>
+                <w:sz w:val="22"/>
+                <w:szCs w:val="22"/>
+              </w:rPr>
+              <w:t>UniProt proteome ID</w:t>
+            </w:r>
+          </w:p>
+        </w:tc>
+        <w:tc>
+          <w:tcPr>
+            <w:tcW w:w="1809" w:type="dxa"/>
+            <w:vAlign w:val="center"/>
+          </w:tcPr>
+          <w:p>
+            <w:pPr>
+              <w:spacing w:line="276" w:lineRule="auto"/>
+              <w:jc w:val="center"/>
+            </w:pPr>
+            <w:r>
+              <w:rPr>
+                <w:b/>
+                <w:bCs/>
+                <w:sz w:val="22"/>
+                <w:szCs w:val="22"/>
+              </w:rPr>
+              <w:t>NCBI</w:t>
+            </w:r>
+            <w:r>
+              <w:rPr>
+                <w:b/>
+                <w:bCs/>
+                <w:sz w:val="22"/>
+                <w:szCs w:val="22"/>
+              </w:rPr>
+              <w:t xml:space="preserve"> </w:t>
+            </w:r>
+            <w:r>
+              <w:rPr>
+                <w:b/>
+                <w:bCs/>
+                <w:sz w:val="22"/>
+                <w:szCs w:val="22"/>
+              </w:rPr>
+              <w:t>taxonomy ID</w:t>
+            </w:r>
+          </w:p>
+        </w:tc>
+        <w:tc>
+          <w:tcPr>
+            <w:tcW w:w="2610" w:type="dxa"/>
+            <w:vAlign w:val="center"/>
+          </w:tcPr>
+          <w:p>
+            <w:pPr>
+              <w:spacing w:line="276" w:lineRule="auto"/>
+              <w:jc w:val="center"/>
+            </w:pPr>
+            <w:r>
+              <w:rPr>
+                <w:b/>
+                <w:bCs/>
+                <w:sz w:val="22"/>
+                <w:szCs w:val="22"/>
+              </w:rPr>
+              <w:t>FASTA filename</w:t>
+            </w:r>
+          </w:p>
+        </w:tc>
+      </w:tr>
+      <w:tr>
+        <w:tc>
+          <w:tcPr>
+            <w:tcW w:w="1980" w:type="dxa"/>
+            <w:vAlign w:val="center"/>
+          </w:tcPr>
+          <w:p>
+            <w:pPr>
+              <w:spacing w:line="276" w:lineRule="auto"/>
+              <w:jc w:val="left"/>
+            </w:pPr>
+            <w:r>
+              <w:rPr>
+                <w:i/>
+                <w:iCs/>
+                <w:sz w:val="22"/>
+                <w:szCs w:val="22"/>
+              </w:rPr>
+              <w:t>Glycine max</w:t>
+            </w:r>
+          </w:p>
+        </w:tc>
+        <w:tc>
+          <w:tcPr>
+            <w:tcW w:w="1721" w:type="dxa"/>
+            <w:vAlign w:val="center"/>
+          </w:tcPr>
+          <w:p>
+            <w:pPr>
+              <w:spacing w:line="276" w:lineRule="auto"/>
+              <w:jc w:val="left"/>
+            </w:pPr>
+            <w:r>
+              <w:rPr>
+                <w:sz w:val="22"/>
+                <w:szCs w:val="22"/>
+              </w:rPr>
+              <w:t>Soybean</w:t>
+            </w:r>
+          </w:p>
+        </w:tc>
+        <w:tc>
+          <w:tcPr>
+            <w:tcW w:w="1960" w:type="dxa"/>
+            <w:vAlign w:val="center"/>
+          </w:tcPr>
+          <w:p>
+            <w:pPr>
+              <w:spacing w:line="276" w:lineRule="auto"/>
+              <w:jc w:val="center"/>
+            </w:pPr>
+            <w:r>
+              <w:rPr>
+                <w:sz w:val="22"/>
+                <w:szCs w:val="22"/>
+              </w:rPr>
+              <w:t>UP000008827</w:t>
+            </w:r>
+          </w:p>
+        </w:tc>
+        <w:tc>
+          <w:tcPr>
+            <w:tcW w:w="1809" w:type="dxa"/>
+            <w:vAlign w:val="center"/>
+          </w:tcPr>
+          <w:p>
+            <w:pPr>
+              <w:spacing w:line="276" w:lineRule="auto"/>
+              <w:jc w:val="center"/>
+            </w:pPr>
+            <w:r>
+              <w:rPr>
+                <w:sz w:val="22"/>
+                <w:szCs w:val="22"/>
+              </w:rPr>
+              <w:t>3847</w:t>
+            </w:r>
+          </w:p>
+        </w:tc>
+        <w:tc>
+          <w:tcPr>
+            <w:tcW w:w="2610" w:type="dxa"/>
+            <w:vAlign w:val="center"/>
+          </w:tcPr>
+          <w:p>
+            <w:pPr>
+              <w:spacing w:line="276" w:lineRule="auto"/>
+              <w:jc w:val="center"/>
+            </w:pPr>
+            <w:r>
+              <w:rPr>
+                <w:sz w:val="22"/>
+                <w:szCs w:val="22"/>
+              </w:rPr>
+              <w:t>UP000008827_3847.fasta</w:t>
+            </w:r>
+          </w:p>
+        </w:tc>
+      </w:tr>
+      <w:tr>
+        <w:tc>
+          <w:tcPr>
+            <w:tcW w:w="1980" w:type="dxa"/>
+            <w:vAlign w:val="center"/>
+          </w:tcPr>
+          <w:p>
+            <w:pPr>
+              <w:spacing w:line="276" w:lineRule="auto"/>
+              <w:jc w:val="left"/>
+            </w:pPr>
+            <w:r>
+              <w:rPr>
+                <w:i/>
+                <w:iCs/>
+                <w:sz w:val="22"/>
+                <w:szCs w:val="22"/>
+              </w:rPr>
+              <w:t>Cicer arietinum</w:t>
+            </w:r>
+          </w:p>
+        </w:tc>
+        <w:tc>
+          <w:tcPr>
+            <w:tcW w:w="1721" w:type="dxa"/>
+            <w:vAlign w:val="center"/>
+          </w:tcPr>
+          <w:p>
+            <w:pPr>
+              <w:spacing w:line="276" w:lineRule="auto"/>
+              <w:jc w:val="left"/>
+            </w:pPr>
+            <w:r>
+              <w:rPr>
+                <w:sz w:val="22"/>
+                <w:szCs w:val="22"/>
+              </w:rPr>
+              <w:t>Chickpea</w:t>
+            </w:r>
+          </w:p>
+        </w:tc>
+        <w:tc>
+          <w:tcPr>
+            <w:tcW w:w="1960" w:type="dxa"/>
+            <w:vAlign w:val="center"/>
+          </w:tcPr>
+          <w:p>
+            <w:pPr>
+              <w:spacing w:line="276" w:lineRule="auto"/>
+              <w:jc w:val="center"/>
+            </w:pPr>
+            <w:r>
+              <w:rPr>
+                <w:sz w:val="22"/>
+                <w:szCs w:val="22"/>
+              </w:rPr>
+              <w:t>UP000087171</w:t>
+            </w:r>
+          </w:p>
+        </w:tc>
+        <w:tc>
+          <w:tcPr>
+            <w:tcW w:w="1809" w:type="dxa"/>
+            <w:vAlign w:val="center"/>
+          </w:tcPr>
+          <w:p>
+            <w:pPr>
+              <w:spacing w:line="276" w:lineRule="auto"/>
+              <w:jc w:val="center"/>
+            </w:pPr>
+            <w:r>
+              <w:rPr>
+                <w:sz w:val="22"/>
+                <w:szCs w:val="22"/>
+              </w:rPr>
+              <w:t>3827</w:t>
+            </w:r>
+          </w:p>
+        </w:tc>
+        <w:tc>
+          <w:tcPr>
+            <w:tcW w:w="2610" w:type="dxa"/>
+            <w:vAlign w:val="center"/>
+          </w:tcPr>
+          <w:p>
+            <w:pPr>
+              <w:spacing w:line="276" w:lineRule="auto"/>
+              <w:jc w:val="center"/>
+            </w:pPr>
+            <w:r>
+              <w:rPr>
+                <w:sz w:val="22"/>
+                <w:szCs w:val="22"/>
+              </w:rPr>
+              <w:t>UP000087171_3827.fasta</w:t>
+            </w:r>
+          </w:p>
+        </w:tc>
+      </w:tr>
+      <w:tr>
+        <w:tc>
+          <w:tcPr>
+            <w:tcW w:w="1980" w:type="dxa"/>
+            <w:vAlign w:val="center"/>
+          </w:tcPr>
+          <w:p>
+            <w:pPr>
+              <w:spacing w:line="276" w:lineRule="auto"/>
+              <w:jc w:val="left"/>
+            </w:pPr>
+            <w:r>
+              <w:rPr>
+                <w:i/>
+                <w:iCs/>
+                <w:sz w:val="22"/>
+                <w:szCs w:val="22"/>
+              </w:rPr>
+              <w:t>Lupinus albus</w:t>
+            </w:r>
+          </w:p>
+        </w:tc>
+        <w:tc>
+          <w:tcPr>
+            <w:tcW w:w="1721" w:type="dxa"/>
+            <w:vAlign w:val="center"/>
+          </w:tcPr>
+          <w:p>
+            <w:pPr>
+              <w:spacing w:line="276" w:lineRule="auto"/>
+              <w:jc w:val="left"/>
+            </w:pPr>
+            <w:r>
+              <w:rPr>
+                <w:sz w:val="22"/>
+                <w:szCs w:val="22"/>
+              </w:rPr>
+              <w:t>White lupin</w:t>
+            </w:r>
+          </w:p>
+        </w:tc>
+        <w:tc>
+          <w:tcPr>
+            <w:tcW w:w="1960" w:type="dxa"/>
+            <w:vAlign w:val="center"/>
+          </w:tcPr>
+          <w:p>
+            <w:pPr>
+              <w:spacing w:line="276" w:lineRule="auto"/>
+              <w:jc w:val="center"/>
+            </w:pPr>
+            <w:r>
+              <w:rPr>
+                <w:sz w:val="22"/>
+                <w:szCs w:val="22"/>
+              </w:rPr>
+              <w:t>UP000447434</w:t>
+            </w:r>
+          </w:p>
+        </w:tc>
+        <w:tc>
+          <w:tcPr>
+            <w:tcW w:w="1809" w:type="dxa"/>
+            <w:vAlign w:val="center"/>
+          </w:tcPr>
+          <w:p>
+            <w:pPr>
+              <w:spacing w:line="276" w:lineRule="auto"/>
+              <w:jc w:val="center"/>
+            </w:pPr>
+            <w:r>
+              <w:rPr>
+                <w:sz w:val="22"/>
+                <w:szCs w:val="22"/>
+              </w:rPr>
+              <w:t>3870</w:t>
+            </w:r>
+          </w:p>
+        </w:tc>
+        <w:tc>
+          <w:tcPr>
+            <w:tcW w:w="2610" w:type="dxa"/>
+            <w:vAlign w:val="center"/>
+          </w:tcPr>
+          <w:p>
+            <w:pPr>
+              <w:spacing w:line="276" w:lineRule="auto"/>
+              <w:jc w:val="center"/>
+            </w:pPr>
+            <w:r>
+              <w:rPr>
+                <w:sz w:val="22"/>
+                <w:szCs w:val="22"/>
+              </w:rPr>
+              <w:t>UP000447434_3870.fasta</w:t>
+            </w:r>
+          </w:p>
+        </w:tc>
+      </w:tr>
+      <w:tr>
+        <w:tc>
+          <w:tcPr>
+            <w:tcW w:w="1980" w:type="dxa"/>
+            <w:vAlign w:val="center"/>
+          </w:tcPr>
+          <w:p>
+            <w:pPr>
+              <w:spacing w:line="276" w:lineRule="auto"/>
+              <w:jc w:val="left"/>
+            </w:pPr>
+            <w:r>
+              <w:rPr>
+                <w:i/>
+                <w:iCs/>
+                <w:sz w:val="22"/>
+                <w:szCs w:val="22"/>
+              </w:rPr>
+              <w:t>Phaseolus vulgaris</w:t>
+            </w:r>
+          </w:p>
+        </w:tc>
+        <w:tc>
+          <w:tcPr>
+            <w:tcW w:w="1721" w:type="dxa"/>
+            <w:vAlign w:val="center"/>
+          </w:tcPr>
+          <w:p>
+            <w:pPr>
+              <w:spacing w:line="276" w:lineRule="auto"/>
+              <w:jc w:val="left"/>
+            </w:pPr>
+            <w:r>
+              <w:rPr>
+                <w:sz w:val="22"/>
+                <w:szCs w:val="22"/>
+              </w:rPr>
+              <w:t>Common bean</w:t>
+            </w:r>
+          </w:p>
+        </w:tc>
+        <w:tc>
+          <w:tcPr>
+            <w:tcW w:w="1960" w:type="dxa"/>
+            <w:vAlign w:val="center"/>
+          </w:tcPr>
+          <w:p>
+            <w:pPr>
+              <w:spacing w:line="276" w:lineRule="auto"/>
+              <w:jc w:val="center"/>
+            </w:pPr>
+            <w:r>
+              <w:rPr>
+                <w:sz w:val="22"/>
+                <w:szCs w:val="22"/>
+              </w:rPr>
+              <w:t>UP000000226</w:t>
+            </w:r>
+          </w:p>
+        </w:tc>
+        <w:tc>
+          <w:tcPr>
+            <w:tcW w:w="1809" w:type="dxa"/>
+            <w:vAlign w:val="center"/>
+          </w:tcPr>
+          <w:p>
+            <w:pPr>
+              <w:spacing w:line="276" w:lineRule="auto"/>
+              <w:jc w:val="center"/>
+            </w:pPr>
+            <w:r>
+              <w:rPr>
+                <w:sz w:val="22"/>
+                <w:szCs w:val="22"/>
+              </w:rPr>
+              <w:t>3885</w:t>
+            </w:r>
+          </w:p>
+        </w:tc>
+        <w:tc>
+          <w:tcPr>
+            <w:tcW w:w="2610" w:type="dxa"/>
+            <w:vAlign w:val="center"/>
+          </w:tcPr>
+          <w:p>
+            <w:pPr>
+              <w:spacing w:line="276" w:lineRule="auto"/>
+              <w:jc w:val="center"/>
+            </w:pPr>
+            <w:r>
+              <w:rPr>
+                <w:sz w:val="22"/>
+                <w:szCs w:val="22"/>
+              </w:rPr>
+              <w:t>UP000000226_3885.fasta</w:t>
+            </w:r>
+          </w:p>
+        </w:tc>
+      </w:tr>
+    </w:tbl>
+    <w:p>
+      <w:pPr>
+        <w:spacing w:line="276" w:lineRule="auto"/>
+        <w:rPr>
+          <w:sz w:val="22"/>
+          <w:szCs w:val="22"/>
+        </w:rPr>
+      </w:pPr>
     </w:p>
     <w:sectPr>
       <w:pgSz w:w="12240" w:h="15840"/>
-      <w:pgMar w:top="1134" w:right="1134" w:bottom="1134" w:left="1134" w:header="720" w:footer="720" w:gutter="0"/>
+      <w:pgMar w:top="720" w:right="1134" w:bottom="630" w:left="1134" w:header="720" w:footer="720" w:gutter="0"/>
       <w:cols w:space="720"/>
       <w:docGrid w:linePitch="360"/>
     </w:sectPr>
@@ -1280,6 +1816,25 @@
     <w:uiPriority w:val="99"/>
     <w:rsid w:val="006C1A84"/>
   </w:style>
+  <w:style w:type="table" w:styleId="TableGrid">
+    <w:name w:val="Table Grid"/>
+    <w:basedOn w:val="TableNormal"/>
+    <w:uiPriority w:val="39"/>
+    <w:rsid w:val="001068D9"/>
+    <w:pPr>
+      <w:spacing w:after="0" w:line="240" w:lineRule="auto"/>
+    </w:pPr>
+    <w:tblPr>
+      <w:tblBorders>
+        <w:top w:val="single" w:sz="4" w:space="0" w:color="auto"/>
+        <w:left w:val="single" w:sz="4" w:space="0" w:color="auto"/>
+        <w:bottom w:val="single" w:sz="4" w:space="0" w:color="auto"/>
+        <w:right w:val="single" w:sz="4" w:space="0" w:color="auto"/>
+        <w:insideH w:val="single" w:sz="4" w:space="0" w:color="auto"/>
+        <w:insideV w:val="single" w:sz="4" w:space="0" w:color="auto"/>
+      </w:tblBorders>
+    </w:tblPr>
+  </w:style>
 </w:styles>
 </file>
 

</xml_diff>

<commit_message>
Add fasta files info and source
</commit_message>
<xml_diff>
--- a/Supplementary_S1_Workflow_Description.docx
+++ b/Supplementary_S1_Workflow_Description.docx
@@ -93,7 +93,23 @@
           <w:sz w:val="22"/>
           <w:szCs w:val="22"/>
         </w:rPr>
-        <w:t>When remove_start_m=True, an N-terminal methionine is removed only when it occurs as the first residue of the normalized original sequence; optional canonical-residue filtering is then applied</w:t>
+        <w:t xml:space="preserve">When </w:t>
+      </w:r>
+      <w:proofErr w:type="spellStart"/>
+      <w:r>
+        <w:rPr>
+          <w:sz w:val="22"/>
+          <w:szCs w:val="22"/>
+        </w:rPr>
+        <w:t>remove_start_m</w:t>
+      </w:r>
+      <w:proofErr w:type="spellEnd"/>
+      <w:r>
+        <w:rPr>
+          <w:sz w:val="22"/>
+          <w:szCs w:val="22"/>
+        </w:rPr>
+        <w:t>=True, an N-terminal methionine is removed only when it occurs as the first residue of the normalized original sequence; optional canonical-residue filtering is then applied</w:t>
       </w:r>
       <w:r>
         <w:rPr>
@@ -132,7 +148,39 @@
           <w:sz w:val="22"/>
           <w:szCs w:val="22"/>
         </w:rPr>
-        <w:t>Localized enrichment is quantified using overlapping sliding windows. For each protein, the workflow calculates the maximum methionine, cysteine, and combined S-AA percentages observed within windows defined by the selected window_size and window_step parameters. In this study, 100-amino-acid windows with a one-residue step were used for the localized-enrichment analysis.</w:t>
+        <w:t xml:space="preserve">Localized enrichment is quantified using overlapping sliding windows. For each protein, the workflow calculates the maximum methionine, cysteine, and combined S-AA percentages observed within windows defined by the selected </w:t>
+      </w:r>
+      <w:proofErr w:type="spellStart"/>
+      <w:r>
+        <w:rPr>
+          <w:sz w:val="22"/>
+          <w:szCs w:val="22"/>
+        </w:rPr>
+        <w:t>window_size</w:t>
+      </w:r>
+      <w:proofErr w:type="spellEnd"/>
+      <w:r>
+        <w:rPr>
+          <w:sz w:val="22"/>
+          <w:szCs w:val="22"/>
+        </w:rPr>
+        <w:t xml:space="preserve"> and </w:t>
+      </w:r>
+      <w:proofErr w:type="spellStart"/>
+      <w:r>
+        <w:rPr>
+          <w:sz w:val="22"/>
+          <w:szCs w:val="22"/>
+        </w:rPr>
+        <w:t>window_step</w:t>
+      </w:r>
+      <w:proofErr w:type="spellEnd"/>
+      <w:r>
+        <w:rPr>
+          <w:sz w:val="22"/>
+          <w:szCs w:val="22"/>
+        </w:rPr>
+        <w:t xml:space="preserve"> parameters. In this study, 100-amino-acid windows with a one-residue step were used for the localized-enrichment analysis.</w:t>
       </w:r>
     </w:p>
     <w:p>
@@ -148,7 +196,23 @@
           <w:sz w:val="22"/>
           <w:szCs w:val="22"/>
         </w:rPr>
-        <w:t>Amino-acid composition matrices quantify the relative frequency, from 0 to 1, of each canonical amino acid within each selected protein. Counts and percentages are also supported. The analytical functions return structured numerical outputs, including pandas DataFrames, summary statistics, ranking tables, and visualization-ready matrices. Graphical representation is performed at the notebook level using standard visualization libraries, allowing adjustment of color scales, resolution, and figure layout.</w:t>
+        <w:t xml:space="preserve">Amino-acid composition matrices quantify the relative frequency, from 0 to 1, of each canonical amino acid within each selected protein. Counts and percentages are also supported. The analytical functions return structured numerical outputs, including pandas </w:t>
+      </w:r>
+      <w:proofErr w:type="spellStart"/>
+      <w:r>
+        <w:rPr>
+          <w:sz w:val="22"/>
+          <w:szCs w:val="22"/>
+        </w:rPr>
+        <w:t>DataFrames</w:t>
+      </w:r>
+      <w:proofErr w:type="spellEnd"/>
+      <w:r>
+        <w:rPr>
+          <w:sz w:val="22"/>
+          <w:szCs w:val="22"/>
+        </w:rPr>
+        <w:t>, summary statistics, ranking tables, and visualization-ready matrices. Graphical representation is performed at the notebook level using standard visualization libraries, allowing adjustment of color scales, resolution, and figure layout.</w:t>
       </w:r>
     </w:p>
     <w:p>
@@ -164,7 +228,23 @@
           <w:sz w:val="22"/>
           <w:szCs w:val="22"/>
         </w:rPr>
-        <w:t>Intermediate and final analytical tables are retained as pandas DataFrames to facilitate inspection, reuse, and export, while figures are generated and saved separately. Together, the saa_proteome library and the accompanying notebooks provide a transparent and reproducible record of the complete pipeline, from raw proteome sequences to proteome-level summaries, ranked S-AA-rich proteins, localized-enrichment profiles, and associated visual outputs.</w:t>
+        <w:t xml:space="preserve">Intermediate and final analytical tables are retained as pandas </w:t>
+      </w:r>
+      <w:proofErr w:type="spellStart"/>
+      <w:r>
+        <w:rPr>
+          <w:sz w:val="22"/>
+          <w:szCs w:val="22"/>
+        </w:rPr>
+        <w:t>DataFrames</w:t>
+      </w:r>
+      <w:proofErr w:type="spellEnd"/>
+      <w:r>
+        <w:rPr>
+          <w:sz w:val="22"/>
+          <w:szCs w:val="22"/>
+        </w:rPr>
+        <w:t xml:space="preserve"> to facilitate inspection, reuse, and export, while figures are generated and saved separately. Together, the saa_proteome library and the accompanying notebooks provide a transparent and reproducible record of the complete pipeline, from raw proteome sequences to proteome-level summaries, ranked S-AA-rich proteins, localized-enrichment profiles, and associated visual outputs.</w:t>
       </w:r>
     </w:p>
     <w:p>
@@ -429,13 +509,16 @@
               <w:spacing w:line="276" w:lineRule="auto"/>
               <w:jc w:val="center"/>
             </w:pPr>
-            <w:r>
-              <w:rPr>
-                <w:sz w:val="22"/>
-                <w:szCs w:val="22"/>
-              </w:rPr>
-              <w:t>UP000008827_3847.fasta</w:t>
-            </w:r>
+            <w:hyperlink r:id="rId6" w:history="1">
+              <w:r>
+                <w:rPr>
+                  <w:rStyle w:val="Hyperlink"/>
+                  <w:sz w:val="22"/>
+                  <w:szCs w:val="22"/>
+                </w:rPr>
+                <w:t>UP000008827_3847.fasta</w:t>
+              </w:r>
+            </w:hyperlink>
           </w:p>
         </w:tc>
       </w:tr>
@@ -528,13 +611,16 @@
               <w:spacing w:line="276" w:lineRule="auto"/>
               <w:jc w:val="center"/>
             </w:pPr>
-            <w:r>
-              <w:rPr>
-                <w:sz w:val="22"/>
-                <w:szCs w:val="22"/>
-              </w:rPr>
-              <w:t>UP000087171_3827.fasta</w:t>
-            </w:r>
+            <w:hyperlink r:id="rId7" w:history="1">
+              <w:r>
+                <w:rPr>
+                  <w:rStyle w:val="Hyperlink"/>
+                  <w:sz w:val="22"/>
+                  <w:szCs w:val="22"/>
+                </w:rPr>
+                <w:t>UP000087171_3827.fasta</w:t>
+              </w:r>
+            </w:hyperlink>
           </w:p>
         </w:tc>
       </w:tr>
@@ -627,13 +713,16 @@
               <w:spacing w:line="276" w:lineRule="auto"/>
               <w:jc w:val="center"/>
             </w:pPr>
-            <w:r>
-              <w:rPr>
-                <w:sz w:val="22"/>
-                <w:szCs w:val="22"/>
-              </w:rPr>
-              <w:t>UP000447434_3870.fasta</w:t>
-            </w:r>
+            <w:hyperlink r:id="rId8" w:history="1">
+              <w:r>
+                <w:rPr>
+                  <w:rStyle w:val="Hyperlink"/>
+                  <w:sz w:val="22"/>
+                  <w:szCs w:val="22"/>
+                </w:rPr>
+                <w:t>UP000447434_3870.fasta</w:t>
+              </w:r>
+            </w:hyperlink>
           </w:p>
         </w:tc>
       </w:tr>
@@ -726,13 +815,16 @@
               <w:spacing w:line="276" w:lineRule="auto"/>
               <w:jc w:val="center"/>
             </w:pPr>
-            <w:r>
-              <w:rPr>
-                <w:sz w:val="22"/>
-                <w:szCs w:val="22"/>
-              </w:rPr>
-              <w:t>UP000000226_3885.fasta</w:t>
-            </w:r>
+            <w:hyperlink r:id="rId9" w:history="1">
+              <w:r>
+                <w:rPr>
+                  <w:rStyle w:val="Hyperlink"/>
+                  <w:sz w:val="22"/>
+                  <w:szCs w:val="22"/>
+                </w:rPr>
+                <w:t>UP000000226_3885.fasta</w:t>
+              </w:r>
+            </w:hyperlink>
           </w:p>
         </w:tc>
       </w:tr>

</xml_diff>

<commit_message>
Update supplementary workflow and sensitivity analysis files
</commit_message>
<xml_diff>
--- a/Supplementary_S1_Workflow_Description.docx
+++ b/Supplementary_S1_Workflow_Description.docx
@@ -1,6 +1,6 @@
 
 <file path=word/document.xml><?xml version="1.0" encoding="utf-8"?>
-<w:document xmlns:wpc="http://schemas.microsoft.com/office/word/2010/wordprocessingCanvas" xmlns:cx="http://schemas.microsoft.com/office/drawing/2014/chartex" xmlns:cx1="http://schemas.microsoft.com/office/drawing/2015/9/8/chartex" xmlns:cx2="http://schemas.microsoft.com/office/drawing/2015/10/21/chartex" xmlns:cx3="http://schemas.microsoft.com/office/drawing/2016/5/9/chartex" xmlns:cx4="http://schemas.microsoft.com/office/drawing/2016/5/10/chartex" xmlns:cx5="http://schemas.microsoft.com/office/drawing/2016/5/11/chartex" xmlns:cx6="http://schemas.microsoft.com/office/drawing/2016/5/12/chartex" xmlns:cx7="http://schemas.microsoft.com/office/drawing/2016/5/13/chartex" xmlns:cx8="http://schemas.microsoft.com/office/drawing/2016/5/14/chartex" xmlns:mc="http://schemas.openxmlformats.org/markup-compatibility/2006" xmlns:aink="http://schemas.microsoft.com/office/drawing/2016/ink" xmlns:am3d="http://schemas.microsoft.com/office/drawing/2017/model3d" xmlns:o="urn:schemas-microsoft-com:office:office" xmlns:oel="http://schemas.microsoft.com/office/2019/extlst" xmlns:r="http://schemas.openxmlformats.org/officeDocument/2006/relationships" xmlns:m="http://schemas.openxmlformats.org/officeDocument/2006/math" xmlns:v="urn:schemas-microsoft-com:vml" xmlns:wp14="http://schemas.microsoft.com/office/word/2010/wordprocessingDrawing" xmlns:wp="http://schemas.openxmlformats.org/drawingml/2006/wordprocessingDrawing" xmlns:w10="urn:schemas-microsoft-com:office:word" xmlns:w="http://schemas.openxmlformats.org/wordprocessingml/2006/main" xmlns:w14="http://schemas.microsoft.com/office/word/2010/wordml" xmlns:w15="http://schemas.microsoft.com/office/word/2012/wordml" xmlns:w16cex="http://schemas.microsoft.com/office/word/2018/wordml/cex" xmlns:w16cid="http://schemas.microsoft.com/office/word/2016/wordml/cid" xmlns:w16="http://schemas.microsoft.com/office/word/2018/wordml" xmlns:w16du="http://schemas.microsoft.com/office/word/2023/wordml/word16du" xmlns:w16sdtdh="http://schemas.microsoft.com/office/word/2020/wordml/sdtdatahash" xmlns:w16sdtfl="http://schemas.microsoft.com/office/word/2024/wordml/sdtformatlock" xmlns:w16se="http://schemas.microsoft.com/office/word/2015/wordml/symex" xmlns:wpg="http://schemas.microsoft.com/office/word/2010/wordprocessingGroup" xmlns:wpi="http://schemas.microsoft.com/office/word/2010/wordprocessingInk" xmlns:wne="http://schemas.microsoft.com/office/word/2006/wordml" xmlns:wps="http://schemas.microsoft.com/office/word/2010/wordprocessingShape" mc:Ignorable="w14 w15 w16se w16cid w16 w16cex w16sdtdh w16sdtfl w16du wp14">
+<w:document xmlns:wpc="http://schemas.microsoft.com/office/word/2010/wordprocessingCanvas" xmlns:cx="http://schemas.microsoft.com/office/drawing/2014/chartex" xmlns:cx1="http://schemas.microsoft.com/office/drawing/2015/9/8/chartex" xmlns:cx2="http://schemas.microsoft.com/office/drawing/2015/10/21/chartex" xmlns:cx3="http://schemas.microsoft.com/office/drawing/2016/5/9/chartex" xmlns:cx4="http://schemas.microsoft.com/office/drawing/2016/5/10/chartex" xmlns:cx5="http://schemas.microsoft.com/office/drawing/2016/5/11/chartex" xmlns:cx6="http://schemas.microsoft.com/office/drawing/2016/5/12/chartex" xmlns:cx7="http://schemas.microsoft.com/office/drawing/2016/5/13/chartex" xmlns:cx8="http://schemas.microsoft.com/office/drawing/2016/5/14/chartex" xmlns:mc="http://schemas.openxmlformats.org/markup-compatibility/2006" xmlns:aink="http://schemas.microsoft.com/office/drawing/2016/ink" xmlns:am3d="http://schemas.microsoft.com/office/drawing/2017/model3d" xmlns:o="urn:schemas-microsoft-com:office:office" xmlns:oel="http://schemas.microsoft.com/office/2019/extlst" xmlns:r="http://schemas.openxmlformats.org/officeDocument/2006/relationships" xmlns:m="http://schemas.openxmlformats.org/officeDocument/2006/math" xmlns:v="urn:schemas-microsoft-com:vml" xmlns:wp14="http://schemas.microsoft.com/office/word/2010/wordprocessingDrawing" xmlns:wp="http://schemas.openxmlformats.org/drawingml/2006/wordprocessingDrawing" xmlns:w10="urn:schemas-microsoft-com:office:word" xmlns:w="http://schemas.openxmlformats.org/wordprocessingml/2006/main" xmlns:w14="http://schemas.microsoft.com/office/word/2010/wordml" xmlns:w15="http://schemas.microsoft.com/office/word/2012/wordml" xmlns:w16cei="http://schemas.microsoft.com/office/word/2026/wordml/cei" xmlns:w16cex="http://schemas.microsoft.com/office/word/2018/wordml/cex" xmlns:w16cid="http://schemas.microsoft.com/office/word/2016/wordml/cid" xmlns:w16="http://schemas.microsoft.com/office/word/2018/wordml" xmlns:w16du="http://schemas.microsoft.com/office/word/2023/wordml/word16du" xmlns:w16sdtdh="http://schemas.microsoft.com/office/word/2020/wordml/sdtdatahash" xmlns:w16sdtfl="http://schemas.microsoft.com/office/word/2024/wordml/sdtformatlock" xmlns:w16se="http://schemas.microsoft.com/office/word/2015/wordml/symex" xmlns:wpg="http://schemas.microsoft.com/office/word/2010/wordprocessingGroup" xmlns:wpi="http://schemas.microsoft.com/office/word/2010/wordprocessingInk" xmlns:wne="http://schemas.microsoft.com/office/word/2006/wordml" xmlns:wps="http://schemas.microsoft.com/office/word/2010/wordprocessingShape" mc:Ignorable="w14 w15 w16se w16cid w16 w16cex w16sdtdh w16sdtfl w16du wp14">
   <w:body>
     <w:p>
       <w:pPr>
@@ -49,7 +49,28 @@
           <w:sz w:val="22"/>
           <w:szCs w:val="22"/>
         </w:rPr>
-        <w:t>This document describes the computational workflow used in this study. Species-specific Jupyter Notebooks (Supplementary Materials S2a to S5b) document and reproduce the analyses performed for each crop proteome, while the comparative notebook provides the proteome-level descriptive comparison. The notebooks use the custom Python library saa_proteome, developed for proteome-wide amino-acid composition analysis with particular emphasis on methionine and cysteine.</w:t>
+        <w:t xml:space="preserve">This document describes the computational workflow used in this study. </w:t>
+      </w:r>
+      <w:r>
+        <w:rPr>
+          <w:sz w:val="22"/>
+          <w:szCs w:val="22"/>
+        </w:rPr>
+        <w:t>Species-specific Jupyter notebooks (Supplementary Materials S2a–S5b) document and reproduce the analyses performed for each crop proteome, while Supplementary Material S9 provides the proteome-level descriptive comparison.</w:t>
+      </w:r>
+      <w:r>
+        <w:rPr>
+          <w:sz w:val="22"/>
+          <w:szCs w:val="22"/>
+        </w:rPr>
+        <w:t xml:space="preserve"> </w:t>
+      </w:r>
+      <w:r>
+        <w:rPr>
+          <w:sz w:val="22"/>
+          <w:szCs w:val="22"/>
+        </w:rPr>
+        <w:t>The notebooks use the custom Python library saa_proteome, developed for proteome-wide amino-acid composition analysis with particular emphasis on methionine and cysteine.</w:t>
       </w:r>
     </w:p>
     <w:p>
@@ -93,30 +114,35 @@
           <w:sz w:val="22"/>
           <w:szCs w:val="22"/>
         </w:rPr>
-        <w:t xml:space="preserve">When </w:t>
-      </w:r>
-      <w:proofErr w:type="spellStart"/>
-      <w:r>
-        <w:rPr>
-          <w:sz w:val="22"/>
-          <w:szCs w:val="22"/>
-        </w:rPr>
-        <w:t>remove_start_m</w:t>
-      </w:r>
-      <w:proofErr w:type="spellEnd"/>
-      <w:r>
-        <w:rPr>
-          <w:sz w:val="22"/>
-          <w:szCs w:val="22"/>
-        </w:rPr>
-        <w:t>=True, an N-terminal methionine is removed only when it occurs as the first residue of the normalized original sequence; optional canonical-residue filtering is then applied</w:t>
-      </w:r>
-      <w:r>
-        <w:rPr>
-          <w:sz w:val="22"/>
-          <w:szCs w:val="22"/>
-        </w:rPr>
-        <w:t xml:space="preserve"> to retain the 20 standard amino acids and exclude noncanonical symbols. The initial-methionine-removed condition was evaluated as a sensitivity analysis because actual N-terminal methionine excision depends on biological and sequence context and cannot be inferred from reference-proteome sequences alone. All preprocessing steps are explicitly parameterized and reproducible.</w:t>
+        <w:t>When remove_start_m=True, an N-terminal methionine is removed only when it occurs as the first residue of the normalized original sequence; optional canonical-residue filtering is then applied</w:t>
+      </w:r>
+      <w:r>
+        <w:rPr>
+          <w:sz w:val="22"/>
+          <w:szCs w:val="22"/>
+        </w:rPr>
+        <w:t xml:space="preserve"> to retain the 20 standard amino acids and exclude noncanonical symbols. </w:t>
+      </w:r>
+      <w:r>
+        <w:rPr>
+          <w:sz w:val="22"/>
+          <w:szCs w:val="22"/>
+        </w:rPr>
+        <w:t>N-terminal methionine retention was evaluated as a sensitivity condition because actual N-terminal methionine excision depends on biological and sequence context and cannot be inferred from reference-proteome sequences alone.</w:t>
+      </w:r>
+      <w:r>
+        <w:rPr>
+          <w:sz w:val="22"/>
+          <w:szCs w:val="22"/>
+        </w:rPr>
+        <w:t xml:space="preserve"> </w:t>
+      </w:r>
+      <w:r>
+        <w:rPr>
+          <w:sz w:val="22"/>
+          <w:szCs w:val="22"/>
+        </w:rPr>
+        <w:t>All preprocessing steps are explicitly parameterized and reproducible.</w:t>
       </w:r>
     </w:p>
     <w:p>
@@ -148,39 +174,7 @@
           <w:sz w:val="22"/>
           <w:szCs w:val="22"/>
         </w:rPr>
-        <w:t xml:space="preserve">Localized enrichment is quantified using overlapping sliding windows. For each protein, the workflow calculates the maximum methionine, cysteine, and combined S-AA percentages observed within windows defined by the selected </w:t>
-      </w:r>
-      <w:proofErr w:type="spellStart"/>
-      <w:r>
-        <w:rPr>
-          <w:sz w:val="22"/>
-          <w:szCs w:val="22"/>
-        </w:rPr>
-        <w:t>window_size</w:t>
-      </w:r>
-      <w:proofErr w:type="spellEnd"/>
-      <w:r>
-        <w:rPr>
-          <w:sz w:val="22"/>
-          <w:szCs w:val="22"/>
-        </w:rPr>
-        <w:t xml:space="preserve"> and </w:t>
-      </w:r>
-      <w:proofErr w:type="spellStart"/>
-      <w:r>
-        <w:rPr>
-          <w:sz w:val="22"/>
-          <w:szCs w:val="22"/>
-        </w:rPr>
-        <w:t>window_step</w:t>
-      </w:r>
-      <w:proofErr w:type="spellEnd"/>
-      <w:r>
-        <w:rPr>
-          <w:sz w:val="22"/>
-          <w:szCs w:val="22"/>
-        </w:rPr>
-        <w:t xml:space="preserve"> parameters. In this study, 100-amino-acid windows with a one-residue step were used for the localized-enrichment analysis.</w:t>
+        <w:t>Localized enrichment is quantified using overlapping sliding windows. For each protein, the workflow calculates the maximum methionine, cysteine, and combined S-AA percentages observed within windows defined by the selected window_size and window_step parameters. In this study, 100-amino-acid windows with a one-residue step were used for the localized-enrichment analysis.</w:t>
       </w:r>
     </w:p>
     <w:p>
@@ -196,23 +190,7 @@
           <w:sz w:val="22"/>
           <w:szCs w:val="22"/>
         </w:rPr>
-        <w:t xml:space="preserve">Amino-acid composition matrices quantify the relative frequency, from 0 to 1, of each canonical amino acid within each selected protein. Counts and percentages are also supported. The analytical functions return structured numerical outputs, including pandas </w:t>
-      </w:r>
-      <w:proofErr w:type="spellStart"/>
-      <w:r>
-        <w:rPr>
-          <w:sz w:val="22"/>
-          <w:szCs w:val="22"/>
-        </w:rPr>
-        <w:t>DataFrames</w:t>
-      </w:r>
-      <w:proofErr w:type="spellEnd"/>
-      <w:r>
-        <w:rPr>
-          <w:sz w:val="22"/>
-          <w:szCs w:val="22"/>
-        </w:rPr>
-        <w:t>, summary statistics, ranking tables, and visualization-ready matrices. Graphical representation is performed at the notebook level using standard visualization libraries, allowing adjustment of color scales, resolution, and figure layout.</w:t>
+        <w:t>Amino-acid composition matrices quantify the relative frequency, from 0 to 1, of each canonical amino acid within each selected protein. Counts and percentages are also supported. The analytical functions return structured numerical outputs, including pandas DataFrames, summary statistics, ranking tables, and visualization-ready matrices. Graphical representation is performed at the notebook level using standard visualization libraries, allowing adjustment of color scales, resolution, and figure layout.</w:t>
       </w:r>
     </w:p>
     <w:p>
@@ -228,23 +206,7 @@
           <w:sz w:val="22"/>
           <w:szCs w:val="22"/>
         </w:rPr>
-        <w:t xml:space="preserve">Intermediate and final analytical tables are retained as pandas </w:t>
-      </w:r>
-      <w:proofErr w:type="spellStart"/>
-      <w:r>
-        <w:rPr>
-          <w:sz w:val="22"/>
-          <w:szCs w:val="22"/>
-        </w:rPr>
-        <w:t>DataFrames</w:t>
-      </w:r>
-      <w:proofErr w:type="spellEnd"/>
-      <w:r>
-        <w:rPr>
-          <w:sz w:val="22"/>
-          <w:szCs w:val="22"/>
-        </w:rPr>
-        <w:t xml:space="preserve"> to facilitate inspection, reuse, and export, while figures are generated and saved separately. Together, the saa_proteome library and the accompanying notebooks provide a transparent and reproducible record of the complete pipeline, from raw proteome sequences to proteome-level summaries, ranked S-AA-rich proteins, localized-enrichment profiles, and associated visual outputs.</w:t>
+        <w:t>Intermediate and final analytical tables are retained as pandas DataFrames to facilitate inspection, reuse, and export, while figures are generated and saved separately. Together, the saa_proteome library and the accompanying notebooks provide a transparent and reproducible record of the complete pipeline, from raw proteome sequences to proteome-level summaries, ranked S-AA-rich proteins, localized-enrichment profiles, and associated visual outputs.</w:t>
       </w:r>
     </w:p>
     <w:p>
@@ -849,7 +811,7 @@
 </file>
 
 <file path=word/endnotes.xml><?xml version="1.0" encoding="utf-8"?>
-<w:endnotes xmlns:wpc="http://schemas.microsoft.com/office/word/2010/wordprocessingCanvas" xmlns:cx="http://schemas.microsoft.com/office/drawing/2014/chartex" xmlns:cx1="http://schemas.microsoft.com/office/drawing/2015/9/8/chartex" xmlns:cx2="http://schemas.microsoft.com/office/drawing/2015/10/21/chartex" xmlns:cx3="http://schemas.microsoft.com/office/drawing/2016/5/9/chartex" xmlns:cx4="http://schemas.microsoft.com/office/drawing/2016/5/10/chartex" xmlns:cx5="http://schemas.microsoft.com/office/drawing/2016/5/11/chartex" xmlns:cx6="http://schemas.microsoft.com/office/drawing/2016/5/12/chartex" xmlns:cx7="http://schemas.microsoft.com/office/drawing/2016/5/13/chartex" xmlns:cx8="http://schemas.microsoft.com/office/drawing/2016/5/14/chartex" xmlns:mc="http://schemas.openxmlformats.org/markup-compatibility/2006" xmlns:aink="http://schemas.microsoft.com/office/drawing/2016/ink" xmlns:am3d="http://schemas.microsoft.com/office/drawing/2017/model3d" xmlns:o="urn:schemas-microsoft-com:office:office" xmlns:oel="http://schemas.microsoft.com/office/2019/extlst" xmlns:r="http://schemas.openxmlformats.org/officeDocument/2006/relationships" xmlns:m="http://schemas.openxmlformats.org/officeDocument/2006/math" xmlns:v="urn:schemas-microsoft-com:vml" xmlns:wp14="http://schemas.microsoft.com/office/word/2010/wordprocessingDrawing" xmlns:wp="http://schemas.openxmlformats.org/drawingml/2006/wordprocessingDrawing" xmlns:w10="urn:schemas-microsoft-com:office:word" xmlns:w="http://schemas.openxmlformats.org/wordprocessingml/2006/main" xmlns:w14="http://schemas.microsoft.com/office/word/2010/wordml" xmlns:w15="http://schemas.microsoft.com/office/word/2012/wordml" xmlns:w16cex="http://schemas.microsoft.com/office/word/2018/wordml/cex" xmlns:w16cid="http://schemas.microsoft.com/office/word/2016/wordml/cid" xmlns:w16="http://schemas.microsoft.com/office/word/2018/wordml" xmlns:w16du="http://schemas.microsoft.com/office/word/2023/wordml/word16du" xmlns:w16sdtdh="http://schemas.microsoft.com/office/word/2020/wordml/sdtdatahash" xmlns:w16sdtfl="http://schemas.microsoft.com/office/word/2024/wordml/sdtformatlock" xmlns:w16se="http://schemas.microsoft.com/office/word/2015/wordml/symex" xmlns:wpg="http://schemas.microsoft.com/office/word/2010/wordprocessingGroup" xmlns:wpi="http://schemas.microsoft.com/office/word/2010/wordprocessingInk" xmlns:wne="http://schemas.microsoft.com/office/word/2006/wordml" xmlns:wps="http://schemas.microsoft.com/office/word/2010/wordprocessingShape" mc:Ignorable="w14 w15 w16se w16cid w16 w16cex w16sdtdh w16sdtfl w16du wp14">
+<w:endnotes xmlns:wpc="http://schemas.microsoft.com/office/word/2010/wordprocessingCanvas" xmlns:cx="http://schemas.microsoft.com/office/drawing/2014/chartex" xmlns:cx1="http://schemas.microsoft.com/office/drawing/2015/9/8/chartex" xmlns:cx2="http://schemas.microsoft.com/office/drawing/2015/10/21/chartex" xmlns:cx3="http://schemas.microsoft.com/office/drawing/2016/5/9/chartex" xmlns:cx4="http://schemas.microsoft.com/office/drawing/2016/5/10/chartex" xmlns:cx5="http://schemas.microsoft.com/office/drawing/2016/5/11/chartex" xmlns:cx6="http://schemas.microsoft.com/office/drawing/2016/5/12/chartex" xmlns:cx7="http://schemas.microsoft.com/office/drawing/2016/5/13/chartex" xmlns:cx8="http://schemas.microsoft.com/office/drawing/2016/5/14/chartex" xmlns:mc="http://schemas.openxmlformats.org/markup-compatibility/2006" xmlns:aink="http://schemas.microsoft.com/office/drawing/2016/ink" xmlns:am3d="http://schemas.microsoft.com/office/drawing/2017/model3d" xmlns:o="urn:schemas-microsoft-com:office:office" xmlns:oel="http://schemas.microsoft.com/office/2019/extlst" xmlns:r="http://schemas.openxmlformats.org/officeDocument/2006/relationships" xmlns:m="http://schemas.openxmlformats.org/officeDocument/2006/math" xmlns:v="urn:schemas-microsoft-com:vml" xmlns:wp14="http://schemas.microsoft.com/office/word/2010/wordprocessingDrawing" xmlns:wp="http://schemas.openxmlformats.org/drawingml/2006/wordprocessingDrawing" xmlns:w10="urn:schemas-microsoft-com:office:word" xmlns:w="http://schemas.openxmlformats.org/wordprocessingml/2006/main" xmlns:w14="http://schemas.microsoft.com/office/word/2010/wordml" xmlns:w15="http://schemas.microsoft.com/office/word/2012/wordml" xmlns:w16cei="http://schemas.microsoft.com/office/word/2026/wordml/cei" xmlns:w16cex="http://schemas.microsoft.com/office/word/2018/wordml/cex" xmlns:w16cid="http://schemas.microsoft.com/office/word/2016/wordml/cid" xmlns:w16="http://schemas.microsoft.com/office/word/2018/wordml" xmlns:w16du="http://schemas.microsoft.com/office/word/2023/wordml/word16du" xmlns:w16sdtdh="http://schemas.microsoft.com/office/word/2020/wordml/sdtdatahash" xmlns:w16sdtfl="http://schemas.microsoft.com/office/word/2024/wordml/sdtformatlock" xmlns:w16se="http://schemas.microsoft.com/office/word/2015/wordml/symex" xmlns:wpg="http://schemas.microsoft.com/office/word/2010/wordprocessingGroup" xmlns:wpi="http://schemas.microsoft.com/office/word/2010/wordprocessingInk" xmlns:wne="http://schemas.microsoft.com/office/word/2006/wordml" xmlns:wps="http://schemas.microsoft.com/office/word/2010/wordprocessingShape" mc:Ignorable="w14 w15 w16se w16cid w16 w16cex w16sdtdh w16sdtfl w16du wp14">
   <w:endnote w:type="separator" w:id="-1">
     <w:p>
       <w:pPr>
@@ -874,7 +836,7 @@
 </file>
 
 <file path=word/footnotes.xml><?xml version="1.0" encoding="utf-8"?>
-<w:footnotes xmlns:wpc="http://schemas.microsoft.com/office/word/2010/wordprocessingCanvas" xmlns:cx="http://schemas.microsoft.com/office/drawing/2014/chartex" xmlns:cx1="http://schemas.microsoft.com/office/drawing/2015/9/8/chartex" xmlns:cx2="http://schemas.microsoft.com/office/drawing/2015/10/21/chartex" xmlns:cx3="http://schemas.microsoft.com/office/drawing/2016/5/9/chartex" xmlns:cx4="http://schemas.microsoft.com/office/drawing/2016/5/10/chartex" xmlns:cx5="http://schemas.microsoft.com/office/drawing/2016/5/11/chartex" xmlns:cx6="http://schemas.microsoft.com/office/drawing/2016/5/12/chartex" xmlns:cx7="http://schemas.microsoft.com/office/drawing/2016/5/13/chartex" xmlns:cx8="http://schemas.microsoft.com/office/drawing/2016/5/14/chartex" xmlns:mc="http://schemas.openxmlformats.org/markup-compatibility/2006" xmlns:aink="http://schemas.microsoft.com/office/drawing/2016/ink" xmlns:am3d="http://schemas.microsoft.com/office/drawing/2017/model3d" xmlns:o="urn:schemas-microsoft-com:office:office" xmlns:oel="http://schemas.microsoft.com/office/2019/extlst" xmlns:r="http://schemas.openxmlformats.org/officeDocument/2006/relationships" xmlns:m="http://schemas.openxmlformats.org/officeDocument/2006/math" xmlns:v="urn:schemas-microsoft-com:vml" xmlns:wp14="http://schemas.microsoft.com/office/word/2010/wordprocessingDrawing" xmlns:wp="http://schemas.openxmlformats.org/drawingml/2006/wordprocessingDrawing" xmlns:w10="urn:schemas-microsoft-com:office:word" xmlns:w="http://schemas.openxmlformats.org/wordprocessingml/2006/main" xmlns:w14="http://schemas.microsoft.com/office/word/2010/wordml" xmlns:w15="http://schemas.microsoft.com/office/word/2012/wordml" xmlns:w16cex="http://schemas.microsoft.com/office/word/2018/wordml/cex" xmlns:w16cid="http://schemas.microsoft.com/office/word/2016/wordml/cid" xmlns:w16="http://schemas.microsoft.com/office/word/2018/wordml" xmlns:w16du="http://schemas.microsoft.com/office/word/2023/wordml/word16du" xmlns:w16sdtdh="http://schemas.microsoft.com/office/word/2020/wordml/sdtdatahash" xmlns:w16sdtfl="http://schemas.microsoft.com/office/word/2024/wordml/sdtformatlock" xmlns:w16se="http://schemas.microsoft.com/office/word/2015/wordml/symex" xmlns:wpg="http://schemas.microsoft.com/office/word/2010/wordprocessingGroup" xmlns:wpi="http://schemas.microsoft.com/office/word/2010/wordprocessingInk" xmlns:wne="http://schemas.microsoft.com/office/word/2006/wordml" xmlns:wps="http://schemas.microsoft.com/office/word/2010/wordprocessingShape" mc:Ignorable="w14 w15 w16se w16cid w16 w16cex w16sdtdh w16sdtfl w16du wp14">
+<w:footnotes xmlns:wpc="http://schemas.microsoft.com/office/word/2010/wordprocessingCanvas" xmlns:cx="http://schemas.microsoft.com/office/drawing/2014/chartex" xmlns:cx1="http://schemas.microsoft.com/office/drawing/2015/9/8/chartex" xmlns:cx2="http://schemas.microsoft.com/office/drawing/2015/10/21/chartex" xmlns:cx3="http://schemas.microsoft.com/office/drawing/2016/5/9/chartex" xmlns:cx4="http://schemas.microsoft.com/office/drawing/2016/5/10/chartex" xmlns:cx5="http://schemas.microsoft.com/office/drawing/2016/5/11/chartex" xmlns:cx6="http://schemas.microsoft.com/office/drawing/2016/5/12/chartex" xmlns:cx7="http://schemas.microsoft.com/office/drawing/2016/5/13/chartex" xmlns:cx8="http://schemas.microsoft.com/office/drawing/2016/5/14/chartex" xmlns:mc="http://schemas.openxmlformats.org/markup-compatibility/2006" xmlns:aink="http://schemas.microsoft.com/office/drawing/2016/ink" xmlns:am3d="http://schemas.microsoft.com/office/drawing/2017/model3d" xmlns:o="urn:schemas-microsoft-com:office:office" xmlns:oel="http://schemas.microsoft.com/office/2019/extlst" xmlns:r="http://schemas.openxmlformats.org/officeDocument/2006/relationships" xmlns:m="http://schemas.openxmlformats.org/officeDocument/2006/math" xmlns:v="urn:schemas-microsoft-com:vml" xmlns:wp14="http://schemas.microsoft.com/office/word/2010/wordprocessingDrawing" xmlns:wp="http://schemas.openxmlformats.org/drawingml/2006/wordprocessingDrawing" xmlns:w10="urn:schemas-microsoft-com:office:word" xmlns:w="http://schemas.openxmlformats.org/wordprocessingml/2006/main" xmlns:w14="http://schemas.microsoft.com/office/word/2010/wordml" xmlns:w15="http://schemas.microsoft.com/office/word/2012/wordml" xmlns:w16cei="http://schemas.microsoft.com/office/word/2026/wordml/cei" xmlns:w16cex="http://schemas.microsoft.com/office/word/2018/wordml/cex" xmlns:w16cid="http://schemas.microsoft.com/office/word/2016/wordml/cid" xmlns:w16="http://schemas.microsoft.com/office/word/2018/wordml" xmlns:w16du="http://schemas.microsoft.com/office/word/2023/wordml/word16du" xmlns:w16sdtdh="http://schemas.microsoft.com/office/word/2020/wordml/sdtdatahash" xmlns:w16sdtfl="http://schemas.microsoft.com/office/word/2024/wordml/sdtformatlock" xmlns:w16se="http://schemas.microsoft.com/office/word/2015/wordml/symex" xmlns:wpg="http://schemas.microsoft.com/office/word/2010/wordprocessingGroup" xmlns:wpi="http://schemas.microsoft.com/office/word/2010/wordprocessingInk" xmlns:wne="http://schemas.microsoft.com/office/word/2006/wordml" xmlns:wps="http://schemas.microsoft.com/office/word/2010/wordprocessingShape" mc:Ignorable="w14 w15 w16se w16cid w16 w16cex w16sdtdh w16sdtfl w16du wp14">
   <w:footnote w:type="separator" w:id="-1">
     <w:p>
       <w:pPr>
@@ -1504,7 +1466,6 @@
   <w:style w:type="character" w:default="1" w:styleId="DefaultParagraphFont">
     <w:name w:val="Default Paragraph Font"/>
     <w:uiPriority w:val="1"/>
-    <w:semiHidden/>
     <w:unhideWhenUsed/>
   </w:style>
   <w:style w:type="table" w:default="1" w:styleId="TableNormal">

</xml_diff>